<commit_message>
Update report: add 2024-2025 literature, repair Word file
Co-Authored-By: Claude Sonnet 5.5 <noreply@anthropic.com>
Claude-Session: https://claude.ai/code/session_01NiAZq2HYm5aSpMQ14jLFy5
</commit_message>
<xml_diff>
--- a/docs/Mini_Project_Report_College_Admission_AI_Chatbot.docx
+++ b/docs/Mini_Project_Report_College_Admission_AI_Chatbot.docx
@@ -2559,7 +2559,7 @@
             </w:pPr>
             <w:r/>
             <w:r>
-              <w:t>5</w:t>
+              <w:t>6</w:t>
             </w:r>
           </w:p>
         </w:tc>
@@ -2620,7 +2620,7 @@
             </w:pPr>
             <w:r/>
             <w:r>
-              <w:t>5</w:t>
+              <w:t>6</w:t>
             </w:r>
           </w:p>
         </w:tc>
@@ -2692,7 +2692,7 @@
             </w:pPr>
             <w:r/>
             <w:r>
-              <w:t>7</w:t>
+              <w:t>8</w:t>
             </w:r>
           </w:p>
         </w:tc>
@@ -2753,7 +2753,7 @@
             </w:pPr>
             <w:r/>
             <w:r>
-              <w:t>7</w:t>
+              <w:t>8</w:t>
             </w:r>
           </w:p>
         </w:tc>
@@ -2814,7 +2814,7 @@
             </w:pPr>
             <w:r/>
             <w:r>
-              <w:t>8</w:t>
+              <w:t>9</w:t>
             </w:r>
           </w:p>
         </w:tc>
@@ -2875,7 +2875,7 @@
             </w:pPr>
             <w:r/>
             <w:r>
-              <w:t>9</w:t>
+              <w:t>10</w:t>
             </w:r>
           </w:p>
         </w:tc>
@@ -2936,7 +2936,7 @@
             </w:pPr>
             <w:r/>
             <w:r>
-              <w:t>10</w:t>
+              <w:t>11</w:t>
             </w:r>
           </w:p>
         </w:tc>
@@ -3008,7 +3008,7 @@
             </w:pPr>
             <w:r/>
             <w:r>
-              <w:t>12</w:t>
+              <w:t>13</w:t>
             </w:r>
           </w:p>
         </w:tc>
@@ -3069,7 +3069,7 @@
             </w:pPr>
             <w:r/>
             <w:r>
-              <w:t>12</w:t>
+              <w:t>13</w:t>
             </w:r>
           </w:p>
         </w:tc>
@@ -3130,7 +3130,7 @@
             </w:pPr>
             <w:r/>
             <w:r>
-              <w:t>12</w:t>
+              <w:t>13</w:t>
             </w:r>
           </w:p>
         </w:tc>
@@ -3191,7 +3191,7 @@
             </w:pPr>
             <w:r/>
             <w:r>
-              <w:t>13</w:t>
+              <w:t>14</w:t>
             </w:r>
           </w:p>
         </w:tc>
@@ -3263,7 +3263,7 @@
             </w:pPr>
             <w:r/>
             <w:r>
-              <w:t>15</w:t>
+              <w:t>16</w:t>
             </w:r>
           </w:p>
         </w:tc>
@@ -3324,7 +3324,7 @@
             </w:pPr>
             <w:r/>
             <w:r>
-              <w:t>15</w:t>
+              <w:t>16</w:t>
             </w:r>
           </w:p>
         </w:tc>
@@ -3385,7 +3385,7 @@
             </w:pPr>
             <w:r/>
             <w:r>
-              <w:t>16</w:t>
+              <w:t>17</w:t>
             </w:r>
           </w:p>
         </w:tc>
@@ -3446,7 +3446,7 @@
             </w:pPr>
             <w:r/>
             <w:r>
-              <w:t>17</w:t>
+              <w:t>18</w:t>
             </w:r>
           </w:p>
         </w:tc>
@@ -3518,7 +3518,7 @@
             </w:pPr>
             <w:r/>
             <w:r>
-              <w:t>19</w:t>
+              <w:t>20</w:t>
             </w:r>
           </w:p>
         </w:tc>
@@ -3579,7 +3579,7 @@
             </w:pPr>
             <w:r/>
             <w:r>
-              <w:t>19</w:t>
+              <w:t>20</w:t>
             </w:r>
           </w:p>
         </w:tc>
@@ -3640,7 +3640,7 @@
             </w:pPr>
             <w:r/>
             <w:r>
-              <w:t>19</w:t>
+              <w:t>20</w:t>
             </w:r>
           </w:p>
         </w:tc>
@@ -3705,7 +3705,7 @@
             </w:pPr>
             <w:r/>
             <w:r>
-              <w:t>20</w:t>
+              <w:t>22</w:t>
             </w:r>
           </w:p>
         </w:tc>
@@ -3770,7 +3770,7 @@
             </w:pPr>
             <w:r/>
             <w:r>
-              <w:t>21</w:t>
+              <w:t>24</w:t>
             </w:r>
           </w:p>
         </w:tc>
@@ -3835,7 +3835,7 @@
             </w:pPr>
             <w:r/>
             <w:r>
-              <w:t>23</w:t>
+              <w:t>26</w:t>
             </w:r>
           </w:p>
         </w:tc>
@@ -4020,7 +4020,7 @@
             </w:pPr>
             <w:r/>
             <w:r>
-              <w:t>9</w:t>
+              <w:t>10</w:t>
             </w:r>
           </w:p>
         </w:tc>
@@ -4084,7 +4084,7 @@
             </w:pPr>
             <w:r/>
             <w:r>
-              <w:t>10</w:t>
+              <w:t>11</w:t>
             </w:r>
           </w:p>
         </w:tc>
@@ -4148,7 +4148,7 @@
             </w:pPr>
             <w:r/>
             <w:r>
-              <w:t>15</w:t>
+              <w:t>16</w:t>
             </w:r>
           </w:p>
         </w:tc>
@@ -4212,7 +4212,7 @@
             </w:pPr>
             <w:r/>
             <w:r>
-              <w:t>15</w:t>
+              <w:t>16</w:t>
             </w:r>
           </w:p>
         </w:tc>
@@ -4276,7 +4276,7 @@
             </w:pPr>
             <w:r/>
             <w:r>
-              <w:t>17</w:t>
+              <w:t>18</w:t>
             </w:r>
           </w:p>
         </w:tc>
@@ -4340,7 +4340,7 @@
             </w:pPr>
             <w:r/>
             <w:r>
-              <w:t>25</w:t>
+              <w:t>28</w:t>
             </w:r>
           </w:p>
         </w:tc>
@@ -4589,7 +4589,7 @@
             </w:pPr>
             <w:r/>
             <w:r>
-              <w:t>7</w:t>
+              <w:t>8</w:t>
             </w:r>
           </w:p>
         </w:tc>
@@ -4653,7 +4653,7 @@
             </w:pPr>
             <w:r/>
             <w:r>
-              <w:t>12</w:t>
+              <w:t>13</w:t>
             </w:r>
           </w:p>
         </w:tc>
@@ -4717,7 +4717,7 @@
             </w:pPr>
             <w:r/>
             <w:r>
-              <w:t>16</w:t>
+              <w:t>17</w:t>
             </w:r>
           </w:p>
         </w:tc>
@@ -4781,7 +4781,7 @@
             </w:pPr>
             <w:r/>
             <w:r>
-              <w:t>17</w:t>
+              <w:t>18</w:t>
             </w:r>
           </w:p>
         </w:tc>
@@ -4845,7 +4845,7 @@
             </w:pPr>
             <w:r/>
             <w:r>
-              <w:t>18</w:t>
+              <w:t>19</w:t>
             </w:r>
           </w:p>
         </w:tc>
@@ -5688,7 +5688,7 @@
         <w:jc w:val="both"/>
       </w:pPr>
       <w:r>
-        <w:t xml:space="preserve">Open-weight models such as the Llama 3 family [8] can be run on a personal computer with free tools, so a university can host its own chatbot without paying for a cloud service or sending student questions to an outside company. This project applies these ideas to The Apollo University, Chittoor: a small Llama 3.2 1B model is run locally with Ollama, an n8n workflow retrieves only the facts that a question needs from official university data [9], and a custom web widget gives students a simple chat window with suggested-prompt chips.</w:t>
+        <w:t xml:space="preserve">Open-weight models such as the Llama 3 family [8] can be run on a personal computer with free tools, so a university can host its own chatbot without paying for a cloud service or sending student questions to an outside company. Recent studies show that RAG chatbots can answer university admission questions accurately [9], [10], [11]. This project applies these ideas to The Apollo University, Chittoor: a small Llama 3.2 1B model is run locally with Ollama, an n8n workflow retrieves only the facts that a question needs from official university data [12], and a custom web widget gives students a simple chat window with suggested-prompt chips.</w:t>
       </w:r>
     </w:p>
     <w:p>
@@ -5851,7 +5851,7 @@
         <w:t xml:space="preserve">Chapter 2</w:t>
       </w:r>
       <w:r>
-        <w:t xml:space="preserve"> surveys eight related works, lists the limitations of existing systems and introduces the proposed system. </w:t>
+        <w:t xml:space="preserve"> surveys eleven related works, lists the limitations of existing systems and introduces the proposed system. </w:t>
       </w:r>
       <w:r>
         <w:rPr>
@@ -5936,7 +5936,7 @@
         <w:jc w:val="both"/>
       </w:pPr>
       <w:r>
-        <w:t xml:space="preserve">Eight works were studied. They cover chatbot technology, the Transformer and large language models, retrieval for question answering, hallucination, and open models that can run locally. Table 2.1 summarises them.</w:t>
+        <w:t xml:space="preserve">Eleven works were studied. They cover chatbot technology, the Transformer and large language models, retrieval for question answering, hallucination, open models that can run locally, and three recent studies (2024 and 2025) of RAG chatbots for universities. Table 2.1 summarises them.</w:t>
       </w:r>
     </w:p>
     <w:p>
@@ -5984,6 +5984,7 @@
       </w:tblGrid>
       <w:tr>
         <w:trPr>
+          <w:cantSplit/>
           <w:tblHeader/>
         </w:trPr>
         <w:tc>
@@ -6151,6 +6152,9 @@
         </w:tc>
       </w:tr>
       <w:tr>
+        <w:trPr>
+          <w:cantSplit/>
+        </w:trPr>
         <w:tc>
           <w:tcPr>
             <w:tcW w:w="700" w:type="dxa"/>
@@ -6298,6 +6302,9 @@
         </w:tc>
       </w:tr>
       <w:tr>
+        <w:trPr>
+          <w:cantSplit/>
+        </w:trPr>
         <w:tc>
           <w:tcPr>
             <w:tcW w:w="700" w:type="dxa"/>
@@ -6445,6 +6452,9 @@
         </w:tc>
       </w:tr>
       <w:tr>
+        <w:trPr>
+          <w:cantSplit/>
+        </w:trPr>
         <w:tc>
           <w:tcPr>
             <w:tcW w:w="700" w:type="dxa"/>
@@ -6592,6 +6602,9 @@
         </w:tc>
       </w:tr>
       <w:tr>
+        <w:trPr>
+          <w:cantSplit/>
+        </w:trPr>
         <w:tc>
           <w:tcPr>
             <w:tcW w:w="700" w:type="dxa"/>
@@ -6739,6 +6752,9 @@
         </w:tc>
       </w:tr>
       <w:tr>
+        <w:trPr>
+          <w:cantSplit/>
+        </w:trPr>
         <w:tc>
           <w:tcPr>
             <w:tcW w:w="700" w:type="dxa"/>
@@ -6886,6 +6902,9 @@
         </w:tc>
       </w:tr>
       <w:tr>
+        <w:trPr>
+          <w:cantSplit/>
+        </w:trPr>
         <w:tc>
           <w:tcPr>
             <w:tcW w:w="700" w:type="dxa"/>
@@ -7033,6 +7052,9 @@
         </w:tc>
       </w:tr>
       <w:tr>
+        <w:trPr>
+          <w:cantSplit/>
+        </w:trPr>
         <w:tc>
           <w:tcPr>
             <w:tcW w:w="700" w:type="dxa"/>
@@ -7180,6 +7202,9 @@
         </w:tc>
       </w:tr>
       <w:tr>
+        <w:trPr>
+          <w:cantSplit/>
+        </w:trPr>
         <w:tc>
           <w:tcPr>
             <w:tcW w:w="700" w:type="dxa"/>
@@ -7326,6 +7351,456 @@
           </w:p>
         </w:tc>
       </w:tr>
+      <w:tr>
+        <w:trPr>
+          <w:cantSplit/>
+        </w:trPr>
+        <w:tc>
+          <w:tcPr>
+            <w:tcW w:w="700" w:type="dxa"/>
+            <w:tcMar>
+              <w:top w:w="60" w:type="dxa"/>
+              <w:left w:w="100" w:type="dxa"/>
+              <w:bottom w:w="60" w:type="dxa"/>
+              <w:right w:w="100" w:type="dxa"/>
+            </w:tcMar>
+            <w:vAlign w:val="center"/>
+          </w:tcPr>
+          <w:p>
+            <w:pPr>
+              <w:spacing w:line="276" w:lineRule="auto"/>
+              <w:jc w:val="center"/>
+            </w:pPr>
+            <w:r>
+              <w:rPr>
+                <w:sz w:val="19"/>
+                <w:szCs w:val="19"/>
+              </w:rPr>
+              <w:t xml:space="preserve">9</w:t>
+            </w:r>
+          </w:p>
+        </w:tc>
+        <w:tc>
+          <w:tcPr>
+            <w:tcW w:w="1400" w:type="dxa"/>
+            <w:tcMar>
+              <w:top w:w="60" w:type="dxa"/>
+              <w:left w:w="100" w:type="dxa"/>
+              <w:bottom w:w="60" w:type="dxa"/>
+              <w:right w:w="100" w:type="dxa"/>
+            </w:tcMar>
+            <w:vAlign w:val="center"/>
+          </w:tcPr>
+          <w:p>
+            <w:pPr>
+              <w:spacing w:line="276" w:lineRule="auto"/>
+            </w:pPr>
+            <w:r>
+              <w:rPr>
+                <w:sz w:val="19"/>
+                <w:szCs w:val="19"/>
+              </w:rPr>
+              <w:t xml:space="preserve">Chen et al., 2024 [9]</w:t>
+            </w:r>
+          </w:p>
+        </w:tc>
+        <w:tc>
+          <w:tcPr>
+            <w:tcW w:w="1600" w:type="dxa"/>
+            <w:tcMar>
+              <w:top w:w="60" w:type="dxa"/>
+              <w:left w:w="100" w:type="dxa"/>
+              <w:bottom w:w="60" w:type="dxa"/>
+              <w:right w:w="100" w:type="dxa"/>
+            </w:tcMar>
+            <w:vAlign w:val="center"/>
+          </w:tcPr>
+          <w:p>
+            <w:pPr>
+              <w:spacing w:line="276" w:lineRule="auto"/>
+            </w:pPr>
+            <w:r>
+              <w:rPr>
+                <w:sz w:val="19"/>
+                <w:szCs w:val="19"/>
+              </w:rPr>
+              <w:t xml:space="preserve">Admission chatbot: ChatGPT 3.5 with RAG (LlamaIndex)</w:t>
+            </w:r>
+          </w:p>
+        </w:tc>
+        <w:tc>
+          <w:tcPr>
+            <w:tcW w:w="1200" w:type="dxa"/>
+            <w:tcMar>
+              <w:top w:w="60" w:type="dxa"/>
+              <w:left w:w="100" w:type="dxa"/>
+              <w:bottom w:w="60" w:type="dxa"/>
+              <w:right w:w="100" w:type="dxa"/>
+            </w:tcMar>
+            <w:vAlign w:val="center"/>
+          </w:tcPr>
+          <w:p>
+            <w:pPr>
+              <w:spacing w:line="276" w:lineRule="auto"/>
+            </w:pPr>
+            <w:r>
+              <w:rPr>
+                <w:sz w:val="19"/>
+                <w:szCs w:val="19"/>
+              </w:rPr>
+              <w:t xml:space="preserve">Admission data of 3 universities; 53 student users</w:t>
+            </w:r>
+          </w:p>
+        </w:tc>
+        <w:tc>
+          <w:tcPr>
+            <w:tcW w:w="1700" w:type="dxa"/>
+            <w:tcMar>
+              <w:top w:w="60" w:type="dxa"/>
+              <w:left w:w="100" w:type="dxa"/>
+              <w:bottom w:w="60" w:type="dxa"/>
+              <w:right w:w="100" w:type="dxa"/>
+            </w:tcMar>
+            <w:vAlign w:val="center"/>
+          </w:tcPr>
+          <w:p>
+            <w:pPr>
+              <w:spacing w:line="276" w:lineRule="auto"/>
+            </w:pPr>
+            <w:r>
+              <w:rPr>
+                <w:sz w:val="19"/>
+                <w:szCs w:val="19"/>
+              </w:rPr>
+              <w:t xml:space="preserve">Accuracy rose from 41.4% to 89.5% with RAG</w:t>
+            </w:r>
+          </w:p>
+        </w:tc>
+        <w:tc>
+          <w:tcPr>
+            <w:tcW w:w="1706" w:type="dxa"/>
+            <w:tcMar>
+              <w:top w:w="60" w:type="dxa"/>
+              <w:left w:w="100" w:type="dxa"/>
+              <w:bottom w:w="60" w:type="dxa"/>
+              <w:right w:w="100" w:type="dxa"/>
+            </w:tcMar>
+            <w:vAlign w:val="center"/>
+          </w:tcPr>
+          <w:p>
+            <w:pPr>
+              <w:spacing w:line="276" w:lineRule="auto"/>
+            </w:pPr>
+            <w:r>
+              <w:rPr>
+                <w:sz w:val="19"/>
+                <w:szCs w:val="19"/>
+              </w:rPr>
+              <w:t xml:space="preserve">Paid cloud model; small user sample</w:t>
+            </w:r>
+          </w:p>
+        </w:tc>
+      </w:tr>
+      <w:tr>
+        <w:trPr>
+          <w:cantSplit/>
+        </w:trPr>
+        <w:tc>
+          <w:tcPr>
+            <w:tcW w:w="700" w:type="dxa"/>
+            <w:tcMar>
+              <w:top w:w="60" w:type="dxa"/>
+              <w:left w:w="100" w:type="dxa"/>
+              <w:bottom w:w="60" w:type="dxa"/>
+              <w:right w:w="100" w:type="dxa"/>
+            </w:tcMar>
+            <w:vAlign w:val="center"/>
+          </w:tcPr>
+          <w:p>
+            <w:pPr>
+              <w:spacing w:line="276" w:lineRule="auto"/>
+              <w:jc w:val="center"/>
+            </w:pPr>
+            <w:r>
+              <w:rPr>
+                <w:sz w:val="19"/>
+                <w:szCs w:val="19"/>
+              </w:rPr>
+              <w:t xml:space="preserve">10</w:t>
+            </w:r>
+          </w:p>
+        </w:tc>
+        <w:tc>
+          <w:tcPr>
+            <w:tcW w:w="1400" w:type="dxa"/>
+            <w:tcMar>
+              <w:top w:w="60" w:type="dxa"/>
+              <w:left w:w="100" w:type="dxa"/>
+              <w:bottom w:w="60" w:type="dxa"/>
+              <w:right w:w="100" w:type="dxa"/>
+            </w:tcMar>
+            <w:vAlign w:val="center"/>
+          </w:tcPr>
+          <w:p>
+            <w:pPr>
+              <w:spacing w:line="276" w:lineRule="auto"/>
+            </w:pPr>
+            <w:r>
+              <w:rPr>
+                <w:sz w:val="19"/>
+                <w:szCs w:val="19"/>
+              </w:rPr>
+              <w:t xml:space="preserve">Trienes et al., 2025 [10]</w:t>
+            </w:r>
+          </w:p>
+        </w:tc>
+        <w:tc>
+          <w:tcPr>
+            <w:tcW w:w="1600" w:type="dxa"/>
+            <w:tcMar>
+              <w:top w:w="60" w:type="dxa"/>
+              <w:left w:w="100" w:type="dxa"/>
+              <w:bottom w:w="60" w:type="dxa"/>
+              <w:right w:w="100" w:type="dxa"/>
+            </w:tcMar>
+            <w:vAlign w:val="center"/>
+          </w:tcPr>
+          <w:p>
+            <w:pPr>
+              <w:spacing w:line="276" w:lineRule="auto"/>
+            </w:pPr>
+            <w:r>
+              <w:rPr>
+                <w:sz w:val="19"/>
+                <w:szCs w:val="19"/>
+              </w:rPr>
+              <w:t xml:space="preserve">Marcel: FAQ retriever with BM25 / dense fallback and open models</w:t>
+            </w:r>
+          </w:p>
+        </w:tc>
+        <w:tc>
+          <w:tcPr>
+            <w:tcW w:w="1200" w:type="dxa"/>
+            <w:tcMar>
+              <w:top w:w="60" w:type="dxa"/>
+              <w:left w:w="100" w:type="dxa"/>
+              <w:bottom w:w="60" w:type="dxa"/>
+              <w:right w:w="100" w:type="dxa"/>
+            </w:tcMar>
+            <w:vAlign w:val="center"/>
+          </w:tcPr>
+          <w:p>
+            <w:pPr>
+              <w:spacing w:line="276" w:lineRule="auto"/>
+            </w:pPr>
+            <w:r>
+              <w:rPr>
+                <w:sz w:val="19"/>
+                <w:szCs w:val="19"/>
+              </w:rPr>
+              <w:t xml:space="preserve">249 university web pages; 95 test questions</w:t>
+            </w:r>
+          </w:p>
+        </w:tc>
+        <w:tc>
+          <w:tcPr>
+            <w:tcW w:w="1700" w:type="dxa"/>
+            <w:tcMar>
+              <w:top w:w="60" w:type="dxa"/>
+              <w:left w:w="100" w:type="dxa"/>
+              <w:bottom w:w="60" w:type="dxa"/>
+              <w:right w:w="100" w:type="dxa"/>
+            </w:tcMar>
+            <w:vAlign w:val="center"/>
+          </w:tcPr>
+          <w:p>
+            <w:pPr>
+              <w:spacing w:line="276" w:lineRule="auto"/>
+            </w:pPr>
+            <w:r>
+              <w:rPr>
+                <w:sz w:val="19"/>
+                <w:szCs w:val="19"/>
+              </w:rPr>
+              <w:t xml:space="preserve">FAQ retriever roughly doubled MRR over the baseline (0.70 vs 0.40)</w:t>
+            </w:r>
+          </w:p>
+        </w:tc>
+        <w:tc>
+          <w:tcPr>
+            <w:tcW w:w="1706" w:type="dxa"/>
+            <w:tcMar>
+              <w:top w:w="60" w:type="dxa"/>
+              <w:left w:w="100" w:type="dxa"/>
+              <w:bottom w:w="60" w:type="dxa"/>
+              <w:right w:w="100" w:type="dxa"/>
+            </w:tcMar>
+            <w:vAlign w:val="center"/>
+          </w:tcPr>
+          <w:p>
+            <w:pPr>
+              <w:spacing w:line="276" w:lineRule="auto"/>
+            </w:pPr>
+            <w:r>
+              <w:rPr>
+                <w:sz w:val="19"/>
+                <w:szCs w:val="19"/>
+              </w:rPr>
+              <w:t xml:space="preserve">Needs curated FAQs; small, single-turn test</w:t>
+            </w:r>
+          </w:p>
+        </w:tc>
+      </w:tr>
+      <w:tr>
+        <w:trPr>
+          <w:cantSplit/>
+        </w:trPr>
+        <w:tc>
+          <w:tcPr>
+            <w:tcW w:w="700" w:type="dxa"/>
+            <w:tcMar>
+              <w:top w:w="60" w:type="dxa"/>
+              <w:left w:w="100" w:type="dxa"/>
+              <w:bottom w:w="60" w:type="dxa"/>
+              <w:right w:w="100" w:type="dxa"/>
+            </w:tcMar>
+            <w:vAlign w:val="center"/>
+          </w:tcPr>
+          <w:p>
+            <w:pPr>
+              <w:spacing w:line="276" w:lineRule="auto"/>
+              <w:jc w:val="center"/>
+            </w:pPr>
+            <w:r>
+              <w:rPr>
+                <w:sz w:val="19"/>
+                <w:szCs w:val="19"/>
+              </w:rPr>
+              <w:t xml:space="preserve">11</w:t>
+            </w:r>
+          </w:p>
+        </w:tc>
+        <w:tc>
+          <w:tcPr>
+            <w:tcW w:w="1400" w:type="dxa"/>
+            <w:tcMar>
+              <w:top w:w="60" w:type="dxa"/>
+              <w:left w:w="100" w:type="dxa"/>
+              <w:bottom w:w="60" w:type="dxa"/>
+              <w:right w:w="100" w:type="dxa"/>
+            </w:tcMar>
+            <w:vAlign w:val="center"/>
+          </w:tcPr>
+          <w:p>
+            <w:pPr>
+              <w:spacing w:line="276" w:lineRule="auto"/>
+            </w:pPr>
+            <w:r>
+              <w:rPr>
+                <w:sz w:val="19"/>
+                <w:szCs w:val="19"/>
+              </w:rPr>
+              <w:t xml:space="preserve">Sarmiento &amp; Lauría, 2025 [11]</w:t>
+            </w:r>
+          </w:p>
+        </w:tc>
+        <w:tc>
+          <w:tcPr>
+            <w:tcW w:w="1600" w:type="dxa"/>
+            <w:tcMar>
+              <w:top w:w="60" w:type="dxa"/>
+              <w:left w:w="100" w:type="dxa"/>
+              <w:bottom w:w="60" w:type="dxa"/>
+              <w:right w:w="100" w:type="dxa"/>
+            </w:tcMar>
+            <w:vAlign w:val="center"/>
+          </w:tcPr>
+          <w:p>
+            <w:pPr>
+              <w:spacing w:line="276" w:lineRule="auto"/>
+            </w:pPr>
+            <w:r>
+              <w:rPr>
+                <w:sz w:val="19"/>
+                <w:szCs w:val="19"/>
+              </w:rPr>
+              <w:t xml:space="preserve">Simple RAG vs Corrective RAG (LangChain, ChromaDB, GPT-4o-mini)</w:t>
+            </w:r>
+          </w:p>
+        </w:tc>
+        <w:tc>
+          <w:tcPr>
+            <w:tcW w:w="1200" w:type="dxa"/>
+            <w:tcMar>
+              <w:top w:w="60" w:type="dxa"/>
+              <w:left w:w="100" w:type="dxa"/>
+              <w:bottom w:w="60" w:type="dxa"/>
+              <w:right w:w="100" w:type="dxa"/>
+            </w:tcMar>
+            <w:vAlign w:val="center"/>
+          </w:tcPr>
+          <w:p>
+            <w:pPr>
+              <w:spacing w:line="276" w:lineRule="auto"/>
+            </w:pPr>
+            <w:r>
+              <w:rPr>
+                <w:sz w:val="19"/>
+                <w:szCs w:val="19"/>
+              </w:rPr>
+              <w:t xml:space="preserve">College website; 667 question–context pairs</w:t>
+            </w:r>
+          </w:p>
+        </w:tc>
+        <w:tc>
+          <w:tcPr>
+            <w:tcW w:w="1700" w:type="dxa"/>
+            <w:tcMar>
+              <w:top w:w="60" w:type="dxa"/>
+              <w:left w:w="100" w:type="dxa"/>
+              <w:bottom w:w="60" w:type="dxa"/>
+              <w:right w:w="100" w:type="dxa"/>
+            </w:tcMar>
+            <w:vAlign w:val="center"/>
+          </w:tcPr>
+          <w:p>
+            <w:pPr>
+              <w:spacing w:line="276" w:lineRule="auto"/>
+            </w:pPr>
+            <w:r>
+              <w:rPr>
+                <w:sz w:val="19"/>
+                <w:szCs w:val="19"/>
+              </w:rPr>
+              <w:t xml:space="preserve">Corrective RAG: higher precision; simple RAG: higher recall</w:t>
+            </w:r>
+          </w:p>
+        </w:tc>
+        <w:tc>
+          <w:tcPr>
+            <w:tcW w:w="1706" w:type="dxa"/>
+            <w:tcMar>
+              <w:top w:w="60" w:type="dxa"/>
+              <w:left w:w="100" w:type="dxa"/>
+              <w:bottom w:w="60" w:type="dxa"/>
+              <w:right w:w="100" w:type="dxa"/>
+            </w:tcMar>
+            <w:vAlign w:val="center"/>
+          </w:tcPr>
+          <w:p>
+            <w:pPr>
+              <w:spacing w:line="276" w:lineRule="auto"/>
+            </w:pPr>
+            <w:r>
+              <w:rPr>
+                <w:sz w:val="19"/>
+                <w:szCs w:val="19"/>
+              </w:rPr>
+              <w:t xml:space="preserve">Cloud model; small samples; one institution</w:t>
+            </w:r>
+          </w:p>
+        </w:tc>
+      </w:tr>
     </w:tbl>
     <w:p>
       <w:pPr>
@@ -7349,6 +7824,15 @@
       </w:pPr>
       <w:r>
         <w:t xml:space="preserve">Lewis et al. [4] combine a language model with a retriever so that the model reads retrieved passages before answering, which makes answers more factual. Karpukhin et al. [5] show that dense retrieval finds relevant passages better than the traditional BM25 keyword method. Ji et al. [6] survey hallucination and explain why models state false facts, and Gao et al. [7] survey RAG methods. Finally, the Llama 3 report of Grattafiori et al. [8] describes open-weight models that can be downloaded and run locally, which makes a private, cost-free deployment possible.</w:t>
+      </w:r>
+    </w:p>
+    <w:p>
+      <w:pPr>
+        <w:spacing w:after="120"/>
+        <w:jc w:val="both"/>
+      </w:pPr>
+      <w:r>
+        <w:t xml:space="preserve">Three recent studies apply RAG to university enquiries. Chen et al. [9] built an admission chatbot with ChatGPT 3.5 and RAG and tested it on admission data from three universities; its accuracy rose from 41.4% without retrieval to 89.5% with it. Trienes et al. [10] describe Marcel, an open-source student-support chatbot whose main part is an FAQ retriever that matches questions to curated FAQs; it roughly doubled retrieval quality (MRR 0.70 against 0.40) and was used by 27 people in a two-week trial. Sarmiento and Lauría [11] compared simple RAG with Corrective RAG on college web pages and found that each is better on different measures. These studies confirm that grounding with retrieved facts works for admission questions, but they use paid cloud models or larger models and vector stores.</w:t>
       </w:r>
     </w:p>
     <w:p>
@@ -7367,7 +7851,7 @@
         <w:jc w:val="both"/>
       </w:pPr>
       <w:r>
-        <w:t xml:space="preserve">The works above show three gaps for a university admission chatbot.</w:t>
+        <w:t xml:space="preserve">The works above show four gaps for a university admission chatbot.</w:t>
       </w:r>
     </w:p>
     <w:p>
@@ -7428,6 +7912,26 @@
       </w:r>
       <w:r>
         <w:t xml:space="preserve"> Dense retrieval and vector indexes need training, extra software and usually a GPU [4], [5], [7], which is more than a small college team can run on a laptop.</w:t>
+      </w:r>
+    </w:p>
+    <w:p>
+      <w:pPr>
+        <w:spacing w:after="80"/>
+        <w:ind w:left="540" w:hanging="360"/>
+        <w:jc w:val="both"/>
+      </w:pPr>
+      <w:r>
+        <w:t xml:space="preserve">4.	</w:t>
+      </w:r>
+      <w:r>
+        <w:rPr>
+          <w:b/>
+          <w:bCs/>
+        </w:rPr>
+        <w:t xml:space="preserve">Recent admission chatbots need paid or larger resources.</w:t>
+      </w:r>
+      <w:r>
+        <w:t xml:space="preserve"> The chatbots in [9] and [11] use the paid cloud models ChatGPT 3.5 and GPT-4o-mini, and [10] needs curated FAQs and was tested with 12B and 70B open models, so none of them targets a CPU-only laptop with a 1B model.</w:t>
       </w:r>
     </w:p>
     <w:p>
@@ -13177,7 +13681,7 @@
                 <w:sz w:val="21"/>
                 <w:szCs w:val="21"/>
               </w:rPr>
-              <w:t xml:space="preserve">Proposed system</w:t>
+              <w:t xml:space="preserve">Recent RAG admission chatbots [9], [10], [11]</w:t>
             </w:r>
           </w:p>
         </w:tc>
@@ -13225,7 +13729,7 @@
                 <w:sz w:val="21"/>
                 <w:szCs w:val="21"/>
               </w:rPr>
-              <w:t xml:space="preserve">Yes (retrieved facts)</w:t>
+              <w:t xml:space="preserve">Yes</w:t>
             </w:r>
           </w:p>
         </w:tc>
@@ -13249,6 +13753,109 @@
                 <w:sz w:val="21"/>
                 <w:szCs w:val="21"/>
               </w:rPr>
+              <w:t xml:space="preserve">Cloud API in [9] and [11]</w:t>
+            </w:r>
+          </w:p>
+        </w:tc>
+      </w:tr>
+      <w:tr>
+        <w:trPr>
+          <w:cantSplit/>
+        </w:trPr>
+        <w:tc>
+          <w:tcPr>
+            <w:tcW w:w="2900" w:type="dxa"/>
+            <w:tcMar>
+              <w:top w:w="50" w:type="dxa"/>
+              <w:left w:w="80" w:type="dxa"/>
+              <w:bottom w:w="50" w:type="dxa"/>
+              <w:right w:w="80" w:type="dxa"/>
+            </w:tcMar>
+            <w:vAlign w:val="center"/>
+          </w:tcPr>
+          <w:p>
+            <w:pPr>
+              <w:spacing w:after="0" w:line="252" w:lineRule="auto"/>
+            </w:pPr>
+            <w:r>
+              <w:rPr>
+                <w:b/>
+                <w:bCs/>
+                <w:sz w:val="21"/>
+                <w:szCs w:val="21"/>
+              </w:rPr>
+              <w:t xml:space="preserve">Proposed system</w:t>
+            </w:r>
+          </w:p>
+        </w:tc>
+        <w:tc>
+          <w:tcPr>
+            <w:tcW w:w="1750" w:type="dxa"/>
+            <w:tcMar>
+              <w:top w:w="50" w:type="dxa"/>
+              <w:left w:w="80" w:type="dxa"/>
+              <w:bottom w:w="50" w:type="dxa"/>
+              <w:right w:w="80" w:type="dxa"/>
+            </w:tcMar>
+            <w:vAlign w:val="center"/>
+          </w:tcPr>
+          <w:p>
+            <w:pPr>
+              <w:spacing w:after="0" w:line="252" w:lineRule="auto"/>
+            </w:pPr>
+            <w:r>
+              <w:rPr>
+                <w:sz w:val="21"/>
+                <w:szCs w:val="21"/>
+              </w:rPr>
+              <w:t xml:space="preserve">Yes</w:t>
+            </w:r>
+          </w:p>
+        </w:tc>
+        <w:tc>
+          <w:tcPr>
+            <w:tcW w:w="1900" w:type="dxa"/>
+            <w:tcMar>
+              <w:top w:w="50" w:type="dxa"/>
+              <w:left w:w="80" w:type="dxa"/>
+              <w:bottom w:w="50" w:type="dxa"/>
+              <w:right w:w="80" w:type="dxa"/>
+            </w:tcMar>
+            <w:vAlign w:val="center"/>
+          </w:tcPr>
+          <w:p>
+            <w:pPr>
+              <w:spacing w:after="0" w:line="252" w:lineRule="auto"/>
+            </w:pPr>
+            <w:r>
+              <w:rPr>
+                <w:sz w:val="21"/>
+                <w:szCs w:val="21"/>
+              </w:rPr>
+              <w:t xml:space="preserve">Yes (retrieved facts)</w:t>
+            </w:r>
+          </w:p>
+        </w:tc>
+        <w:tc>
+          <w:tcPr>
+            <w:tcW w:w="1756" w:type="dxa"/>
+            <w:tcMar>
+              <w:top w:w="50" w:type="dxa"/>
+              <w:left w:w="80" w:type="dxa"/>
+              <w:bottom w:w="50" w:type="dxa"/>
+              <w:right w:w="80" w:type="dxa"/>
+            </w:tcMar>
+            <w:vAlign w:val="center"/>
+          </w:tcPr>
+          <w:p>
+            <w:pPr>
+              <w:spacing w:after="0" w:line="252" w:lineRule="auto"/>
+            </w:pPr>
+            <w:r>
+              <w:rPr>
+                <w:sz w:val="21"/>
+                <w:szCs w:val="21"/>
+              </w:rPr>
               <w:t xml:space="preserve">Yes</w:t>
             </w:r>
           </w:p>
@@ -13323,7 +13930,7 @@
         <w:t xml:space="preserve">Study of techniques.</w:t>
       </w:r>
       <w:r>
-        <w:t xml:space="preserve"> Eight works on chatbots, Transformers, large language models, retrieval, hallucination and open models were studied (Chapter 2), and the gap of a light, local, grounded chatbot was identified.</w:t>
+        <w:t xml:space="preserve"> Eleven works on chatbots, Transformers, large language models, retrieval, hallucination, open models and RAG chatbots for universities were studied (Chapter 2), and the gap of a light, local, grounded chatbot was identified.</w:t>
       </w:r>
     </w:p>
     <w:p>
@@ -13644,7 +14251,67 @@
         <w:jc w:val="both"/>
       </w:pPr>
       <w:r>
-        <w:t xml:space="preserve">[9] The Apollo University, Chittoor, Official website: admissions, fee structure and academics. Available from: &lt;https://apollouniversity.edu.in/&gt; [Accessed October 2026].</w:t>
+        <w:t xml:space="preserve">[9] Chen Z, Zou D, Xie H, Lou H &amp; Pang Z, Facilitating university admission using a chatbot based on large language models with retrieval-augmented generation, </w:t>
+      </w:r>
+      <w:r>
+        <w:rPr>
+          <w:i/>
+          <w:iCs/>
+        </w:rPr>
+        <w:t xml:space="preserve">Educational Technology &amp; Society</w:t>
+      </w:r>
+      <w:r>
+        <w:t xml:space="preserve">, 2024, vol. 27, no. 4, pp. 454–470.</w:t>
+      </w:r>
+    </w:p>
+    <w:p>
+      <w:pPr>
+        <w:spacing w:after="100"/>
+        <w:ind w:left="540" w:hanging="540"/>
+        <w:jc w:val="both"/>
+      </w:pPr>
+      <w:r>
+        <w:t xml:space="preserve">[10] Trienes J, Derzhanskaia A, Schwarzkopf R, Mühling M, Schlötterer J &amp; Seifert C, Marcel: A Lightweight and Open-Source Conversational Agent for University Student Support, </w:t>
+      </w:r>
+      <w:r>
+        <w:rPr>
+          <w:i/>
+          <w:iCs/>
+        </w:rPr>
+        <w:t xml:space="preserve">arXiv preprint</w:t>
+      </w:r>
+      <w:r>
+        <w:t xml:space="preserve">, 2025, arXiv:2507.13937.</w:t>
+      </w:r>
+    </w:p>
+    <w:p>
+      <w:pPr>
+        <w:spacing w:after="100"/>
+        <w:ind w:left="540" w:hanging="540"/>
+        <w:jc w:val="both"/>
+      </w:pPr>
+      <w:r>
+        <w:t xml:space="preserve">[11] Sarmiento C &amp; Lauría EJM, Investigating Flavors of RAG for Applications in College Chatbots, </w:t>
+      </w:r>
+      <w:r>
+        <w:rPr>
+          <w:i/>
+          <w:iCs/>
+        </w:rPr>
+        <w:t xml:space="preserve">Proceedings of the 17th International Conference on Computer Supported Education (CSEDU)</w:t>
+      </w:r>
+      <w:r>
+        <w:t xml:space="preserve">, 2025, vol. 2, pp. 421–428.</w:t>
+      </w:r>
+    </w:p>
+    <w:p>
+      <w:pPr>
+        <w:spacing w:after="100"/>
+        <w:ind w:left="540" w:hanging="540"/>
+        <w:jc w:val="both"/>
+      </w:pPr>
+      <w:r>
+        <w:t xml:space="preserve">[12] The Apollo University, Chittoor, Official website: admissions, fee structure and academics. Available from: &lt;https://apollouniversity.edu.in/&gt; [Accessed October 2026].</w:t>
       </w:r>
     </w:p>
     <w:p>
@@ -15372,7 +16039,7 @@
         <w:t xml:space="preserve">CO1 – PO2 (3), PO12 (3):</w:t>
       </w:r>
       <w:r>
-        <w:t xml:space="preserve"> the problem of repetitive, error-prone admission enquiries was analysed and eight related works were studied (Chapter 2); the survey needed independent reading of new techniques such as RAG and hallucination.</w:t>
+        <w:t xml:space="preserve"> the problem of repetitive, error-prone admission enquiries was analysed and eleven related works were studied (Chapter 2); the survey needed independent reading of new techniques such as RAG and hallucination.</w:t>
       </w:r>
     </w:p>
     <w:p>

</xml_diff>

<commit_message>
Report: add team member, guide and coordinator details
Co-Authored-By: Claude Sonnet 5.5 <noreply@anthropic.com>
Claude-Session: https://claude.ai/code/session_01NiAZq2HYm5aSpMQ14jLFy5
</commit_message>
<xml_diff>
--- a/docs/Mini_Project_Report_College_Admission_AI_Chatbot.docx
+++ b/docs/Mini_Project_Report_College_Admission_AI_Chatbot.docx
@@ -55,7 +55,20 @@
           <w:b/>
           <w:bCs/>
         </w:rPr>
-        <w:t>KOUSHIK  (Register No. __________)</w:t>
+        <w:t>P. R. KOUSHIK  (Register No. 122311520215)</w:t>
+      </w:r>
+    </w:p>
+    <w:p>
+      <w:pPr>
+        <w:spacing w:after="40" w:line="276" w:lineRule="auto"/>
+        <w:jc w:val="center"/>
+      </w:pPr>
+      <w:r>
+        <w:rPr>
+          <w:b/>
+          <w:bCs/>
+        </w:rPr>
+        <w:t>M. RAMAKRISHNA  (Register No. 122311520204)</w:t>
       </w:r>
     </w:p>
     <w:p>
@@ -161,7 +174,7 @@
           <w:sz w:val="28"/>
           <w:szCs w:val="28"/>
         </w:rPr>
-        <w:t>Dr. Lakshmi, Associate Professor</w:t>
+        <w:t>Dr. S. Lakshmi, Assistant Professor</w:t>
       </w:r>
     </w:p>
     <w:p>
@@ -340,7 +353,7 @@
       </w:r>
       <w:proofErr w:type="spellEnd"/>
       <w:r>
-        <w:t xml:space="preserve"> work carried out by us during the ____ Semester of the academic year 2026–2027 under the supervision of Dr. Lakshmi, Associate Professor, Department of Computer Science &amp; Engineering.</w:t>
+        <w:t xml:space="preserve"> work carried out by us during the 7th Semester of the academic year 2026–2027 under the supervision of Dr. S. Lakshmi, Assistant Professor, Department of Computer Science &amp; Engineering.</w:t>
       </w:r>
     </w:p>
     <w:p>
@@ -370,7 +383,15 @@
         <w:spacing w:after="160" w:line="300" w:lineRule="auto"/>
       </w:pPr>
       <w:r>
-        <w:t>1.  KOUSHIK  (Register No. __________)          ______________________</w:t>
+        <w:t>1.  P. R. KOUSHIK  (Register No. 122311520215)    ________________</w:t>
+      </w:r>
+    </w:p>
+    <w:p>
+      <w:pPr>
+        <w:spacing w:after="160" w:line="300" w:lineRule="auto"/>
+      </w:pPr>
+      <w:r>
+        <w:t>2.  M. RAMAKRISHNA  (Register No. 122311520204)    ________________</w:t>
       </w:r>
     </w:p>
     <w:p>
@@ -524,48 +545,58 @@
           <w:b/>
           <w:bCs/>
         </w:rPr>
-        <w:t>Koushik</w:t>
-      </w:r>
-      <w:r>
-        <w:t xml:space="preserve"> (Register No(s): __________), III Year </w:t>
-      </w:r>
-      <w:proofErr w:type="spellStart"/>
-      <w:r>
-        <w:t>B.Tech</w:t>
-      </w:r>
-      <w:proofErr w:type="spellEnd"/>
-      <w:r>
-        <w:t xml:space="preserve">, ____ Semester, under my supervision and guidance, in partial fulfilment of the requirements for the award of the degree of </w:t>
+        <w:t>P. R. Koushik</w:t>
+      </w:r>
+      <w:r>
+        <w:t xml:space="preserve"> (Register No: 122311520215) and </w:t>
       </w:r>
       <w:r>
         <w:rPr>
           <w:b/>
           <w:bCs/>
         </w:rPr>
-        <w:t>Bachelor of Technology</w:t>
-      </w:r>
-      <w:r>
-        <w:t xml:space="preserve"> in </w:t>
+        <w:t>M. Ramakrishna</w:t>
+      </w:r>
+      <w:r>
+        <w:t xml:space="preserve"> (Register No: 122311520204), III Year </w:t>
+      </w:r>
+      <w:proofErr w:type="spellStart"/>
+      <w:r>
+        <w:t>B.Tech</w:t>
+      </w:r>
+      <w:proofErr w:type="spellEnd"/>
+      <w:r>
+        <w:t xml:space="preserve">, 7th Semester, under my supervision and guidance, in partial fulfilment of the requirements for the award of the degree of </w:t>
       </w:r>
       <w:r>
         <w:rPr>
           <w:b/>
           <w:bCs/>
         </w:rPr>
-        <w:t>Computer Science &amp; Engineering (Artificial Intelligence &amp; Data Science)</w:t>
-      </w:r>
-      <w:r>
-        <w:t xml:space="preserve"> by </w:t>
+        <w:t>Bachelor of Technology</w:t>
+      </w:r>
+      <w:r>
+        <w:t xml:space="preserve"> in </w:t>
       </w:r>
       <w:r>
         <w:rPr>
           <w:b/>
           <w:bCs/>
         </w:rPr>
+        <w:t>Computer Science &amp; Engineering (Artificial Intelligence &amp; Data Science)</w:t>
+      </w:r>
+      <w:r>
+        <w:t xml:space="preserve"> by </w:t>
+      </w:r>
+      <w:r>
+        <w:rPr>
+          <w:b/>
+          <w:bCs/>
+        </w:rPr>
         <w:t>The Apollo University, Chittoor</w:t>
       </w:r>
       <w:r>
-        <w:t>, during the academic year 2026–2027. This work was carried out as part of the course __________ – Mini Project.</w:t>
+        <w:t>, during the academic year 2026–2027. This work was carried out as part of the course BTAP4501 – Mini Project.</w:t>
       </w:r>
     </w:p>
     <w:p>
@@ -639,7 +670,7 @@
                 <w:sz w:val="22"/>
                 <w:szCs w:val="22"/>
               </w:rPr>
-              <w:t>Dr. Lakshmi</w:t>
+              <w:t>Dr. S. Lakshmi</w:t>
             </w:r>
           </w:p>
           <w:p>
@@ -651,7 +682,7 @@
                 <w:sz w:val="22"/>
                 <w:szCs w:val="22"/>
               </w:rPr>
-              <w:t>Associate Professor</w:t>
+              <w:t>Assistant Professor</w:t>
             </w:r>
           </w:p>
           <w:p>
@@ -663,7 +694,7 @@
                 <w:sz w:val="22"/>
                 <w:szCs w:val="22"/>
               </w:rPr>
-              <w:t>Dept. of CSE</w:t>
+              <w:t>Dept. of CSE (AI&amp;DS)</w:t>
             </w:r>
           </w:p>
         </w:tc>
@@ -705,7 +736,7 @@
                 <w:sz w:val="22"/>
                 <w:szCs w:val="22"/>
               </w:rPr>
-              <w:t>__________</w:t>
+              <w:t>Dr. T. Vivekanandhan</w:t>
             </w:r>
           </w:p>
           <w:p>
@@ -717,7 +748,7 @@
                 <w:sz w:val="22"/>
                 <w:szCs w:val="22"/>
               </w:rPr>
-              <w:t>Dept. of CSE</w:t>
+              <w:t>Dept. of CSE (AI&amp;DS)</w:t>
             </w:r>
           </w:p>
           <w:p>
@@ -771,7 +802,7 @@
                 <w:sz w:val="22"/>
                 <w:szCs w:val="22"/>
               </w:rPr>
-              <w:t>School of Technology</w:t>
+              <w:t>Prof. D. Jagadeesan</w:t>
             </w:r>
           </w:p>
           <w:p>
@@ -783,6 +814,18 @@
                 <w:sz w:val="22"/>
                 <w:szCs w:val="22"/>
               </w:rPr>
+              <w:t>School of Technology</w:t>
+            </w:r>
+          </w:p>
+          <w:p>
+            <w:pPr>
+              <w:spacing w:line="252" w:lineRule="auto"/>
+            </w:pPr>
+            <w:r>
+              <w:rPr>
+                <w:sz w:val="22"/>
+                <w:szCs w:val="22"/>
+              </w:rPr>
               <w:t>The Apollo University</w:t>
             </w:r>
           </w:p>
@@ -799,7 +842,7 @@
           <w:b/>
           <w:bCs/>
         </w:rPr>
-        <w:t>Submitted for the Mini Project (__________) Viva-Voce Examination held on ____________________</w:t>
+        <w:t>Submitted for the Mini Project (BTAP4501) Viva-Voce Examination held on ____________________</w:t>
       </w:r>
     </w:p>
     <w:tbl>
@@ -933,79 +976,23 @@
         <w:t>“College Admission AI Chatbot”</w:t>
       </w:r>
       <w:r>
-        <w:t xml:space="preserve"> submitted by Koushik has been checked for similarity using </w:t>
+        <w:t xml:space="preserve"> submitted by P. R. Koushik and M. Ramakrishna has been checked for similarity using </w:t>
       </w:r>
       <w:r>
         <w:rPr>
           <w:b/>
           <w:bCs/>
         </w:rPr>
-        <w:t>[</w:t>
+        <w:t>__________</w:t>
       </w:r>
       <w:proofErr w:type="spellStart"/>
-      <w:r>
-        <w:rPr>
-          <w:b/>
-          <w:bCs/>
-        </w:rPr>
-        <w:t>Turnitin</w:t>
-      </w:r>
       <w:proofErr w:type="spellEnd"/>
-      <w:r>
-        <w:rPr>
-          <w:b/>
-          <w:bCs/>
-        </w:rPr>
-        <w:t xml:space="preserve"> / </w:t>
-      </w:r>
       <w:proofErr w:type="spellStart"/>
-      <w:r>
-        <w:rPr>
-          <w:b/>
-          <w:bCs/>
-        </w:rPr>
-        <w:t>iThenticate</w:t>
-      </w:r>
       <w:proofErr w:type="spellEnd"/>
-      <w:r>
-        <w:rPr>
-          <w:b/>
-          <w:bCs/>
-        </w:rPr>
-        <w:t xml:space="preserve"> / </w:t>
-      </w:r>
       <w:proofErr w:type="spellStart"/>
-      <w:r>
-        <w:rPr>
-          <w:b/>
-          <w:bCs/>
-        </w:rPr>
-        <w:t>DrillBit</w:t>
-      </w:r>
       <w:proofErr w:type="spellEnd"/>
-      <w:r>
-        <w:rPr>
-          <w:b/>
-          <w:bCs/>
-        </w:rPr>
-        <w:t xml:space="preserve"> / </w:t>
-      </w:r>
       <w:proofErr w:type="spellStart"/>
-      <w:r>
-        <w:rPr>
-          <w:b/>
-          <w:bCs/>
-        </w:rPr>
-        <w:t>Ouriginal</w:t>
-      </w:r>
       <w:proofErr w:type="spellEnd"/>
-      <w:r>
-        <w:rPr>
-          <w:b/>
-          <w:bCs/>
-        </w:rPr>
-        <w:t>]</w:t>
-      </w:r>
       <w:r>
         <w:t xml:space="preserve"> and the details are as follows:</w:t>
       </w:r>
@@ -1424,7 +1411,7 @@
                 <w:sz w:val="22"/>
                 <w:szCs w:val="22"/>
               </w:rPr>
-              <w:t>Dr. Lakshmi</w:t>
+              <w:t>Dr. S. Lakshmi</w:t>
             </w:r>
           </w:p>
         </w:tc>
@@ -1466,7 +1453,7 @@
                 <w:sz w:val="22"/>
                 <w:szCs w:val="22"/>
               </w:rPr>
-              <w:t>__________</w:t>
+              <w:t>Dr. T. Vivekanandhan</w:t>
             </w:r>
           </w:p>
         </w:tc>
@@ -1493,7 +1480,7 @@
         <w:jc w:val="both"/>
       </w:pPr>
       <w:r>
-        <w:t>We express our sincere gratitude to our project guide Dr. Lakshmi, Associate Professor, Department of Computer Science &amp; Engineering, School of Technology, The Apollo University, Chittoor, for the continuous guidance, valuable suggestions and constructive feedback throughout the course of this project. Their support has been instrumental in the successful completion of this work.</w:t>
+        <w:t>We express our sincere gratitude to our project guide Dr. S. Lakshmi, Assistant Professor, Department of Computer Science &amp; Engineering, School of Technology, The Apollo University, Chittoor, for the continuous guidance, valuable suggestions and constructive feedback throughout the course of this project. Their support has been instrumental in the successful completion of this work.</w:t>
       </w:r>
     </w:p>
     <w:p>
@@ -1511,7 +1498,7 @@
         <w:jc w:val="both"/>
       </w:pPr>
       <w:r>
-        <w:t>We extend our heartfelt thanks to __________, Programme Coordinator, __________, Department of Computer Science &amp; Engineering, School of Technology, The Apollo University, for providing the necessary academic support and facilities to carry out this project effectively.</w:t>
+        <w:t>We extend our heartfelt thanks to Dr. T. Vivekanandhan, Programme Coordinator, Department of Computer Science &amp; Engineering, School of Technology, The Apollo University, for providing the necessary academic support and facilities to carry out this project effectively.</w:t>
       </w:r>
     </w:p>
     <w:p>
@@ -1565,7 +1552,16 @@
         <w:jc w:val="right"/>
       </w:pPr>
       <w:r>
-        <w:t>1.  KOUSHIK  (Register No. __________)</w:t>
+        <w:t>1.  P. R. KOUSHIK  (Register No. 122311520215)</w:t>
+      </w:r>
+    </w:p>
+    <w:p>
+      <w:pPr>
+        <w:spacing w:line="240" w:lineRule="auto"/>
+        <w:jc w:val="right"/>
+      </w:pPr>
+      <w:r>
+        <w:t>2.  M. RAMAKRISHNA  (Register No. 122311520204)</w:t>
       </w:r>
     </w:p>
     <w:p>
@@ -13176,7 +13172,7 @@
         <w:t xml:space="preserve">Response time.</w:t>
       </w:r>
       <w:r>
-        <w:t xml:space="preserve"> The first version, which sent the whole knowledge base with every question, took one to two minutes per answer on the test laptop (CPU only, Intel UHD Graphics 620). After the retrieval, the smaller prompt and the model warm-up were added, the system was clearly faster and the user confirmed that it worked “faster and better”. The preset chips are answered in the browser in 367 to 381 ms (mean 374 ms over five chips). A timing study of typed questions on the final system is left for future work.</w:t>
+        <w:t xml:space="preserve"> The first version, which sent the whole knowledge base with every question, took one to two minutes per answer on the test laptop (CPU only, Intel UHD Graphics 620). After the retrieval, the smaller prompt and the model warm-up were added, the system was clearly faster, and the authors observed that it answered faster and better. The preset chips are answered in the browser in 367 to 381 ms (mean 374 ms over five chips). A timing study of typed questions on the final system is left for future work.</w:t>
       </w:r>
     </w:p>
     <w:p>
@@ -14358,7 +14354,7 @@
         <w:t xml:space="preserve">Course: </w:t>
       </w:r>
       <w:r>
-        <w:t>__________ – Mini Project, ____ Semester</w:t>
+        <w:t>BTAP4501 – Mini Project, 7th Semester</w:t>
       </w:r>
     </w:p>
     <w:p>

</xml_diff>